<commit_message>
docs: respetar el formato de las plantillas del docente
La revisión y la fecha de validación quedan en rojo, como el resto de los
datos de portada de la plantilla, y los extranjerismos técnicos se escriben
en cursiva según la norma académica.

Co-Authored-By: Claude Opus 5.5 <noreply@anthropic.com>
Claude-Session: https://claude.ai/code/session_019yAiQ6SJ8faHeryAa6w9Vi
</commit_message>
<xml_diff>
--- a/Fase 2/Evidencias Individules/Arenas_Gonzalo_2.1_APT122_DiarioReflexionFase2.docx
+++ b/Fase 2/Evidencias Individules/Arenas_Gonzalo_2.1_APT122_DiarioReflexionFase2.docx
@@ -457,7 +457,55 @@
                 <w:color w:val="000000"/>
                 <w:sz w:val="20"/>
               </w:rPr>
-              <w:t>En la semana 8 me hice cargo de la documentación que exige el marco ágil: el Product Vision y el Documento de Diseño con sus diagramas UML. Para no depender del avance del backend, voy a construir el layout general, el inicio de sesión y el menú por rol en paralelo con las migraciones, y a conectarlos a los servicios a medida que estén disponibles. El tablero de GitHub Projects queda como tarea de esta semana.</w:t>
+              <w:t xml:space="preserve">En la semana 8 me hice cargo de la documentación que exige el marco ágil: el </w:t>
+            </w:r>
+            <w:r>
+              <w:rPr>
+                <w:i/>
+                <w:color w:val="000000"/>
+                <w:sz w:val="20"/>
+              </w:rPr>
+              <w:t>Product Vision</w:t>
+            </w:r>
+            <w:r>
+              <w:rPr>
+                <w:i w:val="0"/>
+                <w:color w:val="000000"/>
+                <w:sz w:val="20"/>
+              </w:rPr>
+              <w:t xml:space="preserve"> y el Documento de Diseño con sus diagramas UML. Para no depender del avance del </w:t>
+            </w:r>
+            <w:r>
+              <w:rPr>
+                <w:i/>
+                <w:color w:val="000000"/>
+                <w:sz w:val="20"/>
+              </w:rPr>
+              <w:t>backend</w:t>
+            </w:r>
+            <w:r>
+              <w:rPr>
+                <w:i w:val="0"/>
+                <w:color w:val="000000"/>
+                <w:sz w:val="20"/>
+              </w:rPr>
+              <w:t xml:space="preserve">, voy a construir el </w:t>
+            </w:r>
+            <w:r>
+              <w:rPr>
+                <w:i/>
+                <w:color w:val="000000"/>
+                <w:sz w:val="20"/>
+              </w:rPr>
+              <w:t>layout</w:t>
+            </w:r>
+            <w:r>
+              <w:rPr>
+                <w:i w:val="0"/>
+                <w:color w:val="000000"/>
+                <w:sz w:val="20"/>
+              </w:rPr>
+              <w:t xml:space="preserve"> general, el inicio de sesión y el menú por rol en paralelo con las migraciones, y a conectarlos a los servicios a medida que estén disponibles. El tablero de GitHub Projects queda como tarea de esta semana.</w:t>
             </w:r>
           </w:p>
         </w:tc>
@@ -695,7 +743,23 @@
                 <w:color w:val="000000"/>
                 <w:sz w:val="20"/>
               </w:rPr>
-              <w:t>Destaco mi aporte en la organización del repositorio, las evidencias y la documentación, que es lo que hoy permite mostrar el avance con orden. Debo mejorar en la parte técnica que más me cuesta, el modelado y las consultas, y en anticiparme: no esperar a que el backend esté terminado para avanzar en mi parte. Me propongo integrar algo funcionando en cada rama semanal.</w:t>
+              <w:t xml:space="preserve">Destaco mi aporte en la organización del repositorio, las evidencias y la documentación, que es lo que hoy permite mostrar el avance con orden. Debo mejorar en la parte técnica que más me cuesta, el modelado y las consultas, y en anticiparme: no esperar a que el </w:t>
+            </w:r>
+            <w:r>
+              <w:rPr>
+                <w:i/>
+                <w:color w:val="000000"/>
+                <w:sz w:val="20"/>
+              </w:rPr>
+              <w:t>backend</w:t>
+            </w:r>
+            <w:r>
+              <w:rPr>
+                <w:i w:val="0"/>
+                <w:color w:val="000000"/>
+                <w:sz w:val="20"/>
+              </w:rPr>
+              <w:t xml:space="preserve"> esté terminado para avanzar en mi parte. Me propongo integrar algo funcionando en cada rama semanal.</w:t>
             </w:r>
           </w:p>
         </w:tc>
@@ -926,7 +990,23 @@
                 <w:color w:val="000000"/>
                 <w:sz w:val="20"/>
               </w:rPr>
-              <w:t>Sí. Joaquín concentra el modelo de datos y los servicios, y yo los controladores, las vistas, el panel y los documentos. Para equilibrar la carga y evitar que mis tareas dependan de que él termine, acordamos que yo asumo la documentación ágil y de diseño, las presentaciones y el tablero, y que ambos preparamos la demostración de cierre de cada sprint.</w:t>
+              <w:t xml:space="preserve">Sí. Joaquín concentra el modelo de datos y los servicios, y yo los controladores, las vistas, el panel y los documentos. Para equilibrar la carga y evitar que mis tareas dependan de que él termine, acordamos que yo asumo la documentación ágil y de diseño, las presentaciones y el tablero, y que ambos preparamos la demostración de cierre de cada </w:t>
+            </w:r>
+            <w:r>
+              <w:rPr>
+                <w:i/>
+                <w:color w:val="000000"/>
+                <w:sz w:val="20"/>
+              </w:rPr>
+              <w:t>sprint</w:t>
+            </w:r>
+            <w:r>
+              <w:rPr>
+                <w:i w:val="0"/>
+                <w:color w:val="000000"/>
+                <w:sz w:val="20"/>
+              </w:rPr>
+              <w:t>.</w:t>
             </w:r>
           </w:p>
         </w:tc>
@@ -1057,7 +1137,23 @@
                 <w:color w:val="000000"/>
                 <w:sz w:val="20"/>
               </w:rPr>
-              <w:t>Evalúo bien el trabajo en grupo. Nos complementamos: Joaquín es fuerte en backend y modelado, y yo en la interfaz, la documentación y la presentación. Lo positivo es que las decisiones se discuten y quedan escritas, y que nos decimos las cosas de frente. Lo que podemos mejorar es integrar con más frecuencia y avisar antes cuando algo se atrasa, para que el otro no lo descubra tarde.</w:t>
+              <w:t xml:space="preserve">Evalúo bien el trabajo en grupo. Nos complementamos: Joaquín es fuerte en </w:t>
+            </w:r>
+            <w:r>
+              <w:rPr>
+                <w:i/>
+                <w:color w:val="000000"/>
+                <w:sz w:val="20"/>
+              </w:rPr>
+              <w:t>backend</w:t>
+            </w:r>
+            <w:r>
+              <w:rPr>
+                <w:i w:val="0"/>
+                <w:color w:val="000000"/>
+                <w:sz w:val="20"/>
+              </w:rPr>
+              <w:t xml:space="preserve"> y modelado, y yo en la interfaz, la documentación y la presentación. Lo positivo es que las decisiones se discuten y quedan escritas, y que nos decimos las cosas de frente. Lo que podemos mejorar es integrar con más frecuencia y avisar antes cuando algo se atrasa, para que el otro no lo descubra tarde.</w:t>
             </w:r>
           </w:p>
         </w:tc>

</xml_diff>